<commit_message>
Fixed the typo in name
</commit_message>
<xml_diff>
--- a/assets/abstracts/Flyer_seminar94.docx
+++ b/assets/abstracts/Flyer_seminar94.docx
@@ -646,7 +646,7 @@
           <w:szCs w:val="28"/>
           <w:lang w:val="en-US"/>
         </w:rPr>
-        <w:t>Arindam Chakraborthy</w:t>
+        <w:t>Arindam Chakraborty</w:t>
       </w:r>
       <w:r>
         <w:rPr>
@@ -718,10 +718,8 @@
           <w:szCs w:val="28"/>
           <w:lang w:val="en-US"/>
         </w:rPr>
-        <w:t xml:space="preserve">, </w:t>
-      </w:r>
-      <w:proofErr w:type="spellStart"/>
-      <w:proofErr w:type="gramStart"/>
+        <w:t>, USA</w:t>
+      </w:r>
       <w:r>
         <w:rPr>
           <w:rFonts w:ascii="Times New Roman" w:hAnsi="Times New Roman"/>
@@ -729,7 +727,7 @@
           <w:szCs w:val="28"/>
           <w:lang w:val="en-US"/>
         </w:rPr>
-        <w:t>USA.</w:t>
+        <w:t>.</w:t>
       </w:r>
       <w:r>
         <w:rPr>
@@ -740,7 +738,6 @@
         </w:rPr>
         <w:t>.</w:t>
       </w:r>
-      <w:proofErr w:type="gramEnd"/>
       <w:r>
         <w:rPr>
           <w:rFonts w:ascii="Times New Roman" w:hAnsi="Times New Roman"/>
@@ -748,7 +745,7 @@
           <w:szCs w:val="28"/>
           <w:lang w:val="en-US"/>
         </w:rPr>
-        <w:t>p</w:t>
+        <w:t>.</w:t>
       </w:r>
       <w:r>
         <w:rPr>
@@ -757,9 +754,8 @@
           <w:szCs w:val="28"/>
           <w:lang w:val="en-US"/>
         </w:rPr>
-        <w:t>age</w:t>
-      </w:r>
-      <w:proofErr w:type="spellEnd"/>
+        <w:t>p</w:t>
+      </w:r>
       <w:r>
         <w:rPr>
           <w:rFonts w:ascii="Times New Roman" w:hAnsi="Times New Roman"/>
@@ -767,7 +763,7 @@
           <w:szCs w:val="28"/>
           <w:lang w:val="en-US"/>
         </w:rPr>
-        <w:t xml:space="preserve"> </w:t>
+        <w:t xml:space="preserve">age </w:t>
       </w:r>
       <w:r>
         <w:rPr>
@@ -1010,7 +1006,6 @@
         </w:rPr>
         <w:t>……</w:t>
       </w:r>
-      <w:proofErr w:type="gramStart"/>
       <w:r>
         <w:rPr>
           <w:rFonts w:ascii="Times New Roman" w:hAnsi="Times New Roman"/>
@@ -1043,7 +1038,6 @@
         </w:rPr>
         <w:t>.</w:t>
       </w:r>
-      <w:proofErr w:type="gramEnd"/>
       <w:r>
         <w:rPr>
           <w:rFonts w:ascii="Times New Roman" w:hAnsi="Times New Roman"/>
@@ -1233,9 +1227,12 @@
           <w:sz w:val="24"/>
           <w:szCs w:val="24"/>
         </w:rPr>
-        <w:t>Department of Chemistry</w:t>
-      </w:r>
-      <w:r>
+        <w:t>Department of Chemistry, Syracuse University</w:t>
+      </w:r>
+    </w:p>
+    <w:p>
+      <w:pPr>
+        <w:jc w:val="center"/>
         <w:rPr>
           <w:rFonts w:ascii="Times New Roman" w:hAnsi="Times New Roman"/>
           <w:i/>
@@ -1243,8 +1240,7 @@
           <w:sz w:val="24"/>
           <w:szCs w:val="24"/>
         </w:rPr>
-        <w:t xml:space="preserve">, </w:t>
-      </w:r>
+      </w:pPr>
       <w:r>
         <w:rPr>
           <w:rFonts w:ascii="Times New Roman" w:hAnsi="Times New Roman"/>
@@ -1253,49 +1249,7 @@
           <w:sz w:val="24"/>
           <w:szCs w:val="24"/>
         </w:rPr>
-        <w:t>Syracuse University</w:t>
-      </w:r>
-    </w:p>
-    <w:p>
-      <w:pPr>
-        <w:jc w:val="center"/>
-        <w:rPr>
-          <w:rFonts w:ascii="Times New Roman" w:hAnsi="Times New Roman"/>
-          <w:i/>
-          <w:iCs/>
-          <w:sz w:val="24"/>
-          <w:szCs w:val="24"/>
-        </w:rPr>
-      </w:pPr>
-      <w:r>
-        <w:rPr>
-          <w:rFonts w:ascii="Times New Roman" w:hAnsi="Times New Roman"/>
-          <w:i/>
-          <w:iCs/>
-          <w:sz w:val="24"/>
-          <w:szCs w:val="24"/>
-        </w:rPr>
-        <w:t>4-008 Center for Science and Technology (CST)</w:t>
-      </w:r>
-      <w:r>
-        <w:rPr>
-          <w:rFonts w:ascii="Times New Roman" w:hAnsi="Times New Roman"/>
-          <w:i/>
-          <w:iCs/>
-          <w:sz w:val="24"/>
-          <w:szCs w:val="24"/>
-        </w:rPr>
-        <w:t xml:space="preserve">, </w:t>
-      </w:r>
-      <w:r>
-        <w:rPr>
-          <w:rFonts w:ascii="Times New Roman" w:hAnsi="Times New Roman"/>
-          <w:i/>
-          <w:iCs/>
-          <w:sz w:val="24"/>
-          <w:szCs w:val="24"/>
-        </w:rPr>
-        <w:t>Syracuse, New York 13244</w:t>
+        <w:t>4-008 Center for Science and Technology (CST), Syracuse, New York 13244</w:t>
       </w:r>
     </w:p>
     <w:p>
@@ -1369,6 +1323,7 @@
           <w:rFonts w:ascii="Times New Roman" w:hAnsi="Times New Roman"/>
           <w:b/>
           <w:bCs/>
+          <w:noProof/>
           <w:sz w:val="24"/>
           <w:szCs w:val="24"/>
         </w:rPr>
@@ -1436,6 +1391,7 @@
           <w:rFonts w:ascii="Times New Roman" w:hAnsi="Times New Roman"/>
           <w:b/>
           <w:bCs/>
+          <w:noProof/>
           <w:sz w:val="24"/>
           <w:szCs w:val="24"/>
         </w:rPr>
@@ -1591,25 +1547,7 @@
           <w:sz w:val="24"/>
           <w:szCs w:val="24"/>
         </w:rPr>
-        <w:t xml:space="preserve"> method and a comparison of the results with the </w:t>
-      </w:r>
-      <w:proofErr w:type="gramStart"/>
-      <w:r>
-        <w:rPr>
-          <w:rFonts w:ascii="Times New Roman" w:hAnsi="Times New Roman"/>
-          <w:sz w:val="24"/>
-          <w:szCs w:val="24"/>
-        </w:rPr>
-        <w:t>second-order</w:t>
-      </w:r>
-      <w:proofErr w:type="gramEnd"/>
-      <w:r>
-        <w:rPr>
-          <w:rFonts w:ascii="Times New Roman" w:hAnsi="Times New Roman"/>
-          <w:sz w:val="24"/>
-          <w:szCs w:val="24"/>
-        </w:rPr>
-        <w:t xml:space="preserve"> many-body perturbation theory. The effectiveness and accuracy of the presented approach will be highlighted, showcasing its potential in the study of semiconductor nanoparticles.</w:t>
+        <w:t xml:space="preserve"> method and a comparison of the results with the second-order many-body perturbation theory. The effectiveness and accuracy of the presented approach will be highlighted, showcasing its potential in the study of semiconductor nanoparticles.</w:t>
       </w:r>
     </w:p>
     <w:p>
@@ -1822,6 +1760,7 @@
       <w:r>
         <w:rPr>
           <w:rFonts w:ascii="Times New Roman" w:hAnsi="Times New Roman"/>
+          <w:noProof/>
           <w:sz w:val="24"/>
           <w:szCs w:val="24"/>
         </w:rPr>
@@ -1865,6 +1804,7 @@
         <w:rPr>
           <w:i/>
           <w:iCs/>
+          <w:noProof/>
           <w:lang w:val="en-GB"/>
         </w:rPr>
         <w:drawing>
@@ -1945,61 +1885,7 @@
           <w:szCs w:val="24"/>
         </w:rPr>
         <w:br/>
-        <w:t xml:space="preserve">For many large electronic structure calculations, Time-Dependent Density Functional Theory (TDDFT) provides a good balance between accuracy and computational </w:t>
-      </w:r>
-      <w:proofErr w:type="gramStart"/>
-      <w:r>
-        <w:rPr>
-          <w:rFonts w:ascii="Times New Roman" w:hAnsi="Times New Roman"/>
-          <w:sz w:val="24"/>
-          <w:szCs w:val="24"/>
-        </w:rPr>
-        <w:t>cost, but</w:t>
-      </w:r>
-      <w:proofErr w:type="gramEnd"/>
-      <w:r>
-        <w:rPr>
-          <w:rFonts w:ascii="Times New Roman" w:hAnsi="Times New Roman"/>
-          <w:sz w:val="24"/>
-          <w:szCs w:val="24"/>
-        </w:rPr>
-        <w:t xml:space="preserve"> is almost entirely restricted to an adiabatic exchange-correlation potential. This may provide a reasonably accurate real-time dynamics of many processes, but it fails when the system is driven far from any ground state [1]. We show that the Response-Reformulated TDDFT (RR-</w:t>
-      </w:r>
-      <w:proofErr w:type="gramStart"/>
-      <w:r>
-        <w:rPr>
-          <w:rFonts w:ascii="Times New Roman" w:hAnsi="Times New Roman"/>
-          <w:sz w:val="24"/>
-          <w:szCs w:val="24"/>
-        </w:rPr>
-        <w:t>TDDFT)[</w:t>
-      </w:r>
-      <w:proofErr w:type="gramEnd"/>
-      <w:r>
-        <w:rPr>
-          <w:rFonts w:ascii="Times New Roman" w:hAnsi="Times New Roman"/>
-          <w:sz w:val="24"/>
-          <w:szCs w:val="24"/>
-        </w:rPr>
-        <w:t xml:space="preserve">2] enables an adiabatic approximation to accurately predict the excited-state dynamics, provided the approximation is accurate enough in the response regime. When states of double excitation character become populated, the theory requires a non-adiabatic frequency-dependent exchange-correlation kernel. We show how recent approximations [3,4] incorporated in RR-TDDFT lead to an </w:t>
-      </w:r>
-      <w:proofErr w:type="gramStart"/>
-      <w:r>
-        <w:rPr>
-          <w:rFonts w:ascii="Times New Roman" w:hAnsi="Times New Roman"/>
-          <w:sz w:val="24"/>
-          <w:szCs w:val="24"/>
-        </w:rPr>
-        <w:t>accurate dynamics</w:t>
-      </w:r>
-      <w:proofErr w:type="gramEnd"/>
-      <w:r>
-        <w:rPr>
-          <w:rFonts w:ascii="Times New Roman" w:hAnsi="Times New Roman"/>
-          <w:sz w:val="24"/>
-          <w:szCs w:val="24"/>
-        </w:rPr>
-        <w:t xml:space="preserve"> in a model system.</w:t>
+        <w:t>For many large electronic structure calculations, Time-Dependent Density Functional Theory (TDDFT) provides a good balance between accuracy and computational cost, but is almost entirely restricted to an adiabatic exchange-correlation potential. This may provide a reasonably accurate real-time dynamics of many processes, but it fails when the system is driven far from any ground state [1]. We show that the Response-Reformulated TDDFT (RR-TDDFT)[2] enables an adiabatic approximation to accurately predict the excited-state dynamics, provided the approximation is accurate enough in the response regime. When states of double excitation character become populated, the theory requires a non-adiabatic frequency-dependent exchange-correlation kernel. We show how recent approximations [3,4] incorporated in RR-TDDFT lead to an accurate dynamics in a model system.</w:t>
       </w:r>
     </w:p>
     <w:p>
@@ -2238,25 +2124,7 @@
           <w:sz w:val="24"/>
           <w:szCs w:val="24"/>
         </w:rPr>
-        <w:t xml:space="preserve">Time: Oct 1, </w:t>
-      </w:r>
-      <w:proofErr w:type="gramStart"/>
-      <w:r>
-        <w:rPr>
-          <w:rFonts w:ascii="Times New Roman" w:hAnsi="Times New Roman"/>
-          <w:sz w:val="24"/>
-          <w:szCs w:val="24"/>
-        </w:rPr>
-        <w:t>2025</w:t>
-      </w:r>
-      <w:proofErr w:type="gramEnd"/>
-      <w:r>
-        <w:rPr>
-          <w:rFonts w:ascii="Times New Roman" w:hAnsi="Times New Roman"/>
-          <w:sz w:val="24"/>
-          <w:szCs w:val="24"/>
-        </w:rPr>
-        <w:t xml:space="preserve"> 10:00 AM Eastern Time (US and Canada)</w:t>
+        <w:t>Time: Oct 1, 2025 10:00 AM Eastern Time (US and Canada)</w:t>
       </w:r>
     </w:p>
     <w:p>
@@ -2538,25 +2406,7 @@
           <w:sz w:val="24"/>
           <w:szCs w:val="24"/>
         </w:rPr>
-        <w:t xml:space="preserve">Click the “Subscribe or Unsubscribe” option (purple highlight below) – it will bring you to the next window where you’ll be asked for your email/name (I think it the name is optional to provide). This way, you can subscribe to the mailing list to stay tuned or unsubscribe if you find the seminars irrelevant to you or just get too </w:t>
-      </w:r>
-      <w:proofErr w:type="gramStart"/>
-      <w:r>
-        <w:rPr>
-          <w:rFonts w:ascii="Times New Roman" w:hAnsi="Times New Roman"/>
-          <w:sz w:val="24"/>
-          <w:szCs w:val="24"/>
-        </w:rPr>
-        <w:t>much</w:t>
-      </w:r>
-      <w:proofErr w:type="gramEnd"/>
-      <w:r>
-        <w:rPr>
-          <w:rFonts w:ascii="Times New Roman" w:hAnsi="Times New Roman"/>
-          <w:sz w:val="24"/>
-          <w:szCs w:val="24"/>
-        </w:rPr>
-        <w:t xml:space="preserve"> emails to deal with. </w:t>
+        <w:t xml:space="preserve">Click the “Subscribe or Unsubscribe” option (purple highlight below) – it will bring you to the next window where you’ll be asked for your email/name (I think it the name is optional to provide). This way, you can subscribe to the mailing list to stay tuned or unsubscribe if you find the seminars irrelevant to you or just get too much emails to deal with. </w:t>
       </w:r>
     </w:p>
     <w:p>
@@ -6016,6 +5866,7 @@
   <w:style w:type="character" w:default="1" w:styleId="DefaultParagraphFont">
     <w:name w:val="Default Paragraph Font"/>
     <w:uiPriority w:val="1"/>
+    <w:semiHidden/>
     <w:unhideWhenUsed/>
   </w:style>
   <w:style w:type="table" w:default="1" w:styleId="TableNormal">

</xml_diff>